<commit_message>
Remove unused GenAI declaration alternative from report
Deleted the 'Alternative if no GenAI was used' statement and the
'Keep the statement that applies and delete the other' editing note from
the Gen AI acknowledgement section, leaving only the declaration that
applies to this submission.
</commit_message>
<xml_diff>
--- a/PROG2002 A3 Report.docx
+++ b/PROG2002 A3 Report.docx
@@ -2666,46 +2666,11 @@
     </w:p>
     <w:p>
       <w:pPr>
-        <w:spacing w:after="60" w:before="60"/>
-      </w:pPr>
-      <w:r>
-        <w:rPr>
-          <w:i/>
-          <w:iCs/>
-          <w:color w:val="808080"/>
-          <w:sz w:val="20"/>
-          <w:szCs w:val="20"/>
-        </w:rPr>
-        <w:t xml:space="preserve">Keep the statement that applies and delete the other.</w:t>
-      </w:r>
-    </w:p>
-    <w:p>
-      <w:pPr>
         <w:spacing w:after="160"/>
         <w:jc w:val="both"/>
       </w:pPr>
       <w:r>
         <w:t xml:space="preserve">I acknowledge that I have used GenAI tools to complete this assessment. I used CodeBuddy (an AI coding assistant) to assist with developing and debugging the application code, to help draft and structure this project report, and to check the grammar, clarity and formatting of the report, within the parameters outlined in the Assessment Brief and by the Unit Assessor.</w:t>
-      </w:r>
-    </w:p>
-    <w:p>
-      <w:r>
-        <w:t xml:space="preserve"/>
-      </w:r>
-    </w:p>
-    <w:p>
-      <w:pPr>
-        <w:spacing w:after="60" w:before="60"/>
-      </w:pPr>
-      <w:r>
-        <w:rPr>
-          <w:i/>
-          <w:iCs/>
-          <w:color w:val="808080"/>
-          <w:sz w:val="20"/>
-          <w:szCs w:val="20"/>
-        </w:rPr>
-        <w:t xml:space="preserve">Alternative if no GenAI was used: "I acknowledge that I have not knowingly used GenAI to complete this assessment."</w:t>
       </w:r>
     </w:p>
     <w:p>

</xml_diff>

<commit_message>
Add registration confirmation and blocked deletion screenshots to report
Replaced the two remaining screenshot placeholders in the Screenshots
section with real captures from the running applications:
- Figure 8: confirmation message shown after POST /api/events/8/registrations
  succeeds (Sophie Bennett, 2 tickets, Sunrise Charity Walk)
- Figure 9: the admin dashboard displaying the 409 Conflict reason returned
  when deleting an event that still has registrations
</commit_message>
<xml_diff>
--- a/PROG2002 A3 Report.docx
+++ b/PROG2002 A3 Report.docx
@@ -2617,38 +2617,126 @@
     </w:p>
     <w:p>
       <w:pPr>
-        <w:pBdr>
-          <w:bottom w:val="dashed" w:color="AAAAAA" w:sz="6" w:space="4"/>
-        </w:pBdr>
-        <w:spacing w:after="120" w:before="120"/>
+        <w:spacing w:after="60" w:before="160"/>
+        <w:jc w:val="center"/>
+      </w:pPr>
+      <w:r>
+        <w:drawing>
+          <wp:inline distT="0" distB="0" distL="0" distR="0">
+            <wp:extent cx="5400000" cy="3037500"/>
+            <wp:effectExtent t="0" r="0" b="0" l="0"/>
+            <wp:docPr id="100" name="fig8" descr="Figure 8: Registration confirmation — the API response confirms Sophie Bennett’s" title="Figure 8: Registration confirmation — the API response confirms Sophie Bennett’s"/>
+            <wp:cNvGraphicFramePr>
+              <a:graphicFrameLocks xmlns:a="http://schemas.openxmlformats.org/drawingml/2006/main" noChangeAspect="1"/>
+            </wp:cNvGraphicFramePr>
+            <a:graphic xmlns:a="http://schemas.openxmlformats.org/drawingml/2006/main">
+              <a:graphicData uri="http://schemas.openxmlformats.org/drawingml/2006/picture">
+                <pic:pic xmlns:pic="http://schemas.openxmlformats.org/drawingml/2006/picture">
+                  <pic:nvPicPr>
+                    <pic:cNvPr id="0" name="" descr=""/>
+                    <pic:cNvPicPr>
+                      <a:picLocks noChangeAspect="1" noChangeArrowheads="1"/>
+                    </pic:cNvPicPr>
+                  </pic:nvPicPr>
+                  <pic:blipFill>
+                    <a:blip r:embed="rId15" cstate="none"/>
+                    <a:srcRect/>
+                    <a:stretch>
+                      <a:fillRect/>
+                    </a:stretch>
+                  </pic:blipFill>
+                  <pic:spPr bwMode="auto">
+                    <a:xfrm>
+                      <a:off x="0" y="0"/>
+                      <a:ext cx="5400000" cy="3037500"/>
+                    </a:xfrm>
+                    <a:prstGeom prst="rect">
+                      <a:avLst/>
+                    </a:prstGeom>
+                  </pic:spPr>
+                </pic:pic>
+              </a:graphicData>
+            </a:graphic>
+          </wp:inline>
+        </w:drawing>
+      </w:r>
+    </w:p>
+    <w:p>
+      <w:pPr>
+        <w:spacing w:after="240"/>
+        <w:jc w:val="center"/>
       </w:pPr>
       <w:r>
         <w:rPr>
           <w:i/>
           <w:iCs/>
-          <w:color w:val="999999"/>
+          <w:color w:val="555555"/>
           <w:sz w:val="20"/>
           <w:szCs w:val="20"/>
         </w:rPr>
-        <w:t xml:space="preserve">[ insert screenshot: the confirmation message after submitting a registration ]</w:t>
-      </w:r>
-    </w:p>
-    <w:p>
-      <w:pPr>
-        <w:pBdr>
-          <w:bottom w:val="dashed" w:color="AAAAAA" w:sz="6" w:space="4"/>
-        </w:pBdr>
-        <w:spacing w:after="120" w:before="120"/>
+        <w:t xml:space="preserve">Figure 8: Registration confirmation — the API response confirms Sophie Bennett’s two tickets for the Sunrise Charity Walk, with navigation back to the event and to the home page.</w:t>
+      </w:r>
+    </w:p>
+    <w:p>
+      <w:pPr>
+        <w:spacing w:after="60" w:before="160"/>
+        <w:jc w:val="center"/>
+      </w:pPr>
+      <w:r>
+        <w:drawing>
+          <wp:inline distT="0" distB="0" distL="0" distR="0">
+            <wp:extent cx="5400000" cy="3375000"/>
+            <wp:effectExtent t="0" r="0" b="0" l="0"/>
+            <wp:docPr id="101" name="fig9" descr="Figure 9: Blocked deletion — the dashboard calls DELETE /api/events/:id, the API" title="Figure 9: Blocked deletion — the dashboard calls DELETE /api/events/:id, the API"/>
+            <wp:cNvGraphicFramePr>
+              <a:graphicFrameLocks xmlns:a="http://schemas.openxmlformats.org/drawingml/2006/main" noChangeAspect="1"/>
+            </wp:cNvGraphicFramePr>
+            <a:graphic xmlns:a="http://schemas.openxmlformats.org/drawingml/2006/main">
+              <a:graphicData uri="http://schemas.openxmlformats.org/drawingml/2006/picture">
+                <pic:pic xmlns:pic="http://schemas.openxmlformats.org/drawingml/2006/picture">
+                  <pic:nvPicPr>
+                    <pic:cNvPr id="0" name="" descr=""/>
+                    <pic:cNvPicPr>
+                      <a:picLocks noChangeAspect="1" noChangeArrowheads="1"/>
+                    </pic:cNvPicPr>
+                  </pic:nvPicPr>
+                  <pic:blipFill>
+                    <a:blip r:embed="rId16" cstate="none"/>
+                    <a:srcRect/>
+                    <a:stretch>
+                      <a:fillRect/>
+                    </a:stretch>
+                  </pic:blipFill>
+                  <pic:spPr bwMode="auto">
+                    <a:xfrm>
+                      <a:off x="0" y="0"/>
+                      <a:ext cx="5400000" cy="3375000"/>
+                    </a:xfrm>
+                    <a:prstGeom prst="rect">
+                      <a:avLst/>
+                    </a:prstGeom>
+                  </pic:spPr>
+                </pic:pic>
+              </a:graphicData>
+            </a:graphic>
+          </wp:inline>
+        </w:drawing>
+      </w:r>
+    </w:p>
+    <w:p>
+      <w:pPr>
+        <w:spacing w:after="240"/>
+        <w:jc w:val="center"/>
       </w:pPr>
       <w:r>
         <w:rPr>
           <w:i/>
           <w:iCs/>
-          <w:color w:val="999999"/>
+          <w:color w:val="555555"/>
           <w:sz w:val="20"/>
           <w:szCs w:val="20"/>
         </w:rPr>
-        <w:t xml:space="preserve">[ insert screenshot: a blocked deletion (Delete on an event that has registrations) ]</w:t>
+        <w:t xml:space="preserve">Figure 9: Blocked deletion — the dashboard calls DELETE /api/events/:id, the API answers 409 Conflict because the event still has registrations, and the reason is shown to the staff member.</w:t>
       </w:r>
     </w:p>
     <w:p>

</xml_diff>

<commit_message>
Ignore local build tooling and add the completed individual report
</commit_message>
<xml_diff>
--- a/PROG2002 A3 Report.docx
+++ b/PROG2002 A3 Report.docx
@@ -38,7 +38,7 @@
           <w:b/>
           <w:bCs/>
         </w:rPr>
-        <w:t xml:space="preserve">Student ID: 24832407</w:t>
+        <w:t>Student ID: 24832407</w:t>
       </w:r>
     </w:p>
     <w:p>
@@ -47,7 +47,7 @@
           <w:b/>
           <w:bCs/>
         </w:rPr>
-        <w:t xml:space="preserve">Last Name: Liu</w:t>
+        <w:t>Last Name: Liu</w:t>
       </w:r>
     </w:p>
     <w:p>
@@ -56,7 +56,7 @@
           <w:b/>
           <w:bCs/>
         </w:rPr>
-        <w:t xml:space="preserve">First Name: Boyu</w:t>
+        <w:t>First Name: Boyu</w:t>
       </w:r>
     </w:p>
     <w:p>
@@ -65,7 +65,7 @@
           <w:b/>
           <w:bCs/>
         </w:rPr>
-        <w:t xml:space="preserve">Team members: Boyu Liu (24832407), Xiang Hu</w:t>
+        <w:t>Team members: Boyu Liu (24832407), Xiang Hu (24832203)</w:t>
       </w:r>
     </w:p>
     <w:p>
@@ -2165,7 +2165,7 @@
         <w:jc w:val="both"/>
       </w:pPr>
       <w:r>
-        <w:t xml:space="preserve">Public URLs – client site: ______________ ; admin site: ______________ ; API: ______________</w:t>
+        <w:t>Public URLs - client site: https://24832407.it.scu.edu.au/ ; admin site: https://24832407.it.scu.edu.au/admin/ ; API: https://24832407.it.scu.edu.au/api/events</w:t>
       </w:r>
     </w:p>
     <w:p>
@@ -2742,6 +2742,46 @@
     <w:p>
       <w:r>
         <w:br w:type="page"/>
+      </w:r>
+    </w:p>
+    <w:p>
+      <w:r>
+        <w:rPr>
+          <w:b/>
+        </w:rPr>
+        <w:t>Individual contribution</w:t>
+      </w:r>
+    </w:p>
+    <w:p>
+      <w:r>
+        <w:rPr>
+          <w:b w:val="0"/>
+        </w:rPr>
+        <w:t>Designed and extended the MySQL database: added the registrations table with the UNIQUE (event_id, email) constraint, DEFAULT CURRENT_TIMESTAMP on the registration date, the foreign key to events, and the latitude and longitude columns used by the weather API. Prepared the single SQL export containing the schema and seed data (3 organisations, 5 categories, 11 events, 10 registrations).</w:t>
+      </w:r>
+    </w:p>
+    <w:p>
+      <w:r>
+        <w:rPr>
+          <w:b w:val="0"/>
+        </w:rPr>
+        <w:t>Implemented the complete Node.js and Express REST API (server.js, event_db.js): ten resource-based endpoints, a shared MySQL connection pool, parameterised queries on every statement, server-side validation, and the business rule that refuses to delete an event which still has registrations (409 Conflict).</w:t>
+      </w:r>
+    </w:p>
+    <w:p>
+      <w:r>
+        <w:rPr>
+          <w:b w:val="0"/>
+        </w:rPr>
+        <w:t>Built the client-side Angular 22 application: the home page, the search page (filter by date, location and category), the event detail page integrating the Open-Meteo weather forecast together with the "who is coming" registration list, and the registration form with full validation.</w:t>
+      </w:r>
+    </w:p>
+    <w:p>
+      <w:r>
+        <w:rPr>
+          <w:b w:val="0"/>
+        </w:rPr>
+        <w:t>Deployed the API and both front ends to my own SCU cPanel account and wrote the deployment documentation for the project.</w:t>
       </w:r>
     </w:p>
     <w:p>

</xml_diff>

<commit_message>
Shorten the demo video scripts and correct the report seed data and URLs
</commit_message>
<xml_diff>
--- a/PROG2002 A3 Report.docx
+++ b/PROG2002 A3 Report.docx
@@ -975,7 +975,7 @@
         <w:jc w:val="both"/>
       </w:pPr>
       <w:r>
-        <w:t xml:space="preserve">Initial data. The database is seeded with 3 organisations, 5 categories, 11 events and 14 registrations, comfortably above the required minimum of 10 registrations. Event dates are inserted relative to CURDATE(), so the sample data always contains a realistic mix of upcoming and past events whenever the file is imported. The complete schema and data are exported to a single file, charityevents_db.sql, so the marker can recreate the database in one step.</w:t>
+        <w:t>Initial data. The database is seeded with 3 organisations, 5 categories, 11 events and 10 registrations, comfortably above the required minimum of 10 registrations. Event dates are inserted relative to CURDATE(), so the sample data always contains a realistic mix of upcoming and past events whenever the file is imported. The complete schema and data are exported to a single file, charityevents_db.sql, so the marker can recreate the database in one step.</w:t>
       </w:r>
     </w:p>
     <w:p>
@@ -2166,6 +2166,14 @@
       </w:pPr>
       <w:r>
         <w:t>Public URLs - client site: https://24832407.it.scu.edu.au/ ; admin site: https://24832407.it.scu.edu.au/admin/ ; API: https://24832407.it.scu.edu.au/api/events</w:t>
+      </w:r>
+    </w:p>
+    <w:p>
+      <w:r>
+        <w:rPr>
+          <w:b w:val="0"/>
+        </w:rPr>
+        <w:t>GitHub repository: https://github.com/lbyyy139/PROG2002-A3-Charity-Events</w:t>
       </w:r>
     </w:p>
     <w:p>

</xml_diff>